<commit_message>
Fit sections 4, 6 and 8 into their three-page budget
The builder was emitting US Letter with 3.17 cm side margins, while the report
it merges into is A4 with 2.54 cm, so every page estimate taken from this file
was measured on the wrong page. The page setup now matches the Milestone 3
report, and the inter-section page break is gone: these sections drop into the
middle of the merged document, not onto fresh pages.

Content cut from 1,517 to 1,403 words, which Word now lays out as 3 pages
(section 4 spanning pages 1-2, section 6 pages 2-3, section 8 page 3). The
hypothesis table's evidence column is terser, the generalisation and limitations
paragraphs are condensed, and recommendation 6 is gone: the guideline asks for
three to five actions and there were six, with its monitoring-alert figure
folded into recommendation 1 and its data-improvement points already covered by
the future work in section 8.

All figures still reconcile.
</commit_message>
<xml_diff>
--- a/report/M4/BIN381_M4_PersonB_Sections_4_6_8.docx
+++ b/report/M4/BIN381_M4_PersonB_Sections_4_6_8.docx
@@ -47,19 +47,19 @@
         <w:tblLook w:firstColumn="1" w:firstRow="1" w:lastColumn="0" w:lastRow="0" w:noHBand="0" w:noVBand="1" w:val="04A0"/>
       </w:tblPr>
       <w:tblGrid>
-        <w:gridCol w:w="1080"/>
-        <w:gridCol w:w="1080"/>
-        <w:gridCol w:w="1080"/>
-        <w:gridCol w:w="1080"/>
-        <w:gridCol w:w="1080"/>
-        <w:gridCol w:w="1080"/>
-        <w:gridCol w:w="1080"/>
-        <w:gridCol w:w="1080"/>
+        <w:gridCol w:w="1128"/>
+        <w:gridCol w:w="1128"/>
+        <w:gridCol w:w="1128"/>
+        <w:gridCol w:w="1128"/>
+        <w:gridCol w:w="1128"/>
+        <w:gridCol w:w="1128"/>
+        <w:gridCol w:w="1128"/>
+        <w:gridCol w:w="1128"/>
       </w:tblGrid>
       <w:tr>
         <w:tc>
           <w:tcPr>
-            <w:tcW w:type="dxa" w:w="1080"/>
+            <w:tcW w:type="dxa" w:w="1128"/>
           </w:tcPr>
           <w:p>
             <w:pPr>
@@ -76,7 +76,7 @@
         </w:tc>
         <w:tc>
           <w:tcPr>
-            <w:tcW w:type="dxa" w:w="1080"/>
+            <w:tcW w:type="dxa" w:w="1128"/>
           </w:tcPr>
           <w:p>
             <w:pPr>
@@ -93,7 +93,7 @@
         </w:tc>
         <w:tc>
           <w:tcPr>
-            <w:tcW w:type="dxa" w:w="1080"/>
+            <w:tcW w:type="dxa" w:w="1128"/>
           </w:tcPr>
           <w:p>
             <w:pPr>
@@ -110,7 +110,7 @@
         </w:tc>
         <w:tc>
           <w:tcPr>
-            <w:tcW w:type="dxa" w:w="1080"/>
+            <w:tcW w:type="dxa" w:w="1128"/>
           </w:tcPr>
           <w:p>
             <w:pPr>
@@ -127,7 +127,7 @@
         </w:tc>
         <w:tc>
           <w:tcPr>
-            <w:tcW w:type="dxa" w:w="1080"/>
+            <w:tcW w:type="dxa" w:w="1128"/>
           </w:tcPr>
           <w:p>
             <w:pPr>
@@ -144,7 +144,7 @@
         </w:tc>
         <w:tc>
           <w:tcPr>
-            <w:tcW w:type="dxa" w:w="1080"/>
+            <w:tcW w:type="dxa" w:w="1128"/>
           </w:tcPr>
           <w:p>
             <w:pPr>
@@ -161,7 +161,7 @@
         </w:tc>
         <w:tc>
           <w:tcPr>
-            <w:tcW w:type="dxa" w:w="1080"/>
+            <w:tcW w:type="dxa" w:w="1128"/>
           </w:tcPr>
           <w:p>
             <w:pPr>
@@ -178,7 +178,7 @@
         </w:tc>
         <w:tc>
           <w:tcPr>
-            <w:tcW w:type="dxa" w:w="1080"/>
+            <w:tcW w:type="dxa" w:w="1128"/>
           </w:tcPr>
           <w:p>
             <w:pPr>
@@ -197,7 +197,7 @@
       <w:tr>
         <w:tc>
           <w:tcPr>
-            <w:tcW w:type="dxa" w:w="1080"/>
+            <w:tcW w:type="dxa" w:w="1128"/>
           </w:tcPr>
           <w:p>
             <w:pPr>
@@ -214,7 +214,7 @@
         </w:tc>
         <w:tc>
           <w:tcPr>
-            <w:tcW w:type="dxa" w:w="1080"/>
+            <w:tcW w:type="dxa" w:w="1128"/>
           </w:tcPr>
           <w:p>
             <w:pPr>
@@ -231,7 +231,7 @@
         </w:tc>
         <w:tc>
           <w:tcPr>
-            <w:tcW w:type="dxa" w:w="1080"/>
+            <w:tcW w:type="dxa" w:w="1128"/>
           </w:tcPr>
           <w:p>
             <w:pPr>
@@ -248,7 +248,7 @@
         </w:tc>
         <w:tc>
           <w:tcPr>
-            <w:tcW w:type="dxa" w:w="1080"/>
+            <w:tcW w:type="dxa" w:w="1128"/>
           </w:tcPr>
           <w:p>
             <w:pPr>
@@ -265,7 +265,7 @@
         </w:tc>
         <w:tc>
           <w:tcPr>
-            <w:tcW w:type="dxa" w:w="1080"/>
+            <w:tcW w:type="dxa" w:w="1128"/>
           </w:tcPr>
           <w:p>
             <w:pPr>
@@ -282,7 +282,7 @@
         </w:tc>
         <w:tc>
           <w:tcPr>
-            <w:tcW w:type="dxa" w:w="1080"/>
+            <w:tcW w:type="dxa" w:w="1128"/>
           </w:tcPr>
           <w:p>
             <w:pPr>
@@ -299,7 +299,7 @@
         </w:tc>
         <w:tc>
           <w:tcPr>
-            <w:tcW w:type="dxa" w:w="1080"/>
+            <w:tcW w:type="dxa" w:w="1128"/>
           </w:tcPr>
           <w:p>
             <w:pPr>
@@ -316,7 +316,7 @@
         </w:tc>
         <w:tc>
           <w:tcPr>
-            <w:tcW w:type="dxa" w:w="1080"/>
+            <w:tcW w:type="dxa" w:w="1128"/>
           </w:tcPr>
           <w:p>
             <w:pPr>
@@ -335,7 +335,7 @@
       <w:tr>
         <w:tc>
           <w:tcPr>
-            <w:tcW w:type="dxa" w:w="1080"/>
+            <w:tcW w:type="dxa" w:w="1128"/>
           </w:tcPr>
           <w:p>
             <w:pPr>
@@ -352,7 +352,7 @@
         </w:tc>
         <w:tc>
           <w:tcPr>
-            <w:tcW w:type="dxa" w:w="1080"/>
+            <w:tcW w:type="dxa" w:w="1128"/>
           </w:tcPr>
           <w:p>
             <w:pPr>
@@ -369,7 +369,7 @@
         </w:tc>
         <w:tc>
           <w:tcPr>
-            <w:tcW w:type="dxa" w:w="1080"/>
+            <w:tcW w:type="dxa" w:w="1128"/>
           </w:tcPr>
           <w:p>
             <w:pPr>
@@ -386,7 +386,7 @@
         </w:tc>
         <w:tc>
           <w:tcPr>
-            <w:tcW w:type="dxa" w:w="1080"/>
+            <w:tcW w:type="dxa" w:w="1128"/>
           </w:tcPr>
           <w:p>
             <w:pPr>
@@ -403,7 +403,7 @@
         </w:tc>
         <w:tc>
           <w:tcPr>
-            <w:tcW w:type="dxa" w:w="1080"/>
+            <w:tcW w:type="dxa" w:w="1128"/>
           </w:tcPr>
           <w:p>
             <w:pPr>
@@ -420,7 +420,7 @@
         </w:tc>
         <w:tc>
           <w:tcPr>
-            <w:tcW w:type="dxa" w:w="1080"/>
+            <w:tcW w:type="dxa" w:w="1128"/>
           </w:tcPr>
           <w:p>
             <w:pPr>
@@ -437,7 +437,7 @@
         </w:tc>
         <w:tc>
           <w:tcPr>
-            <w:tcW w:type="dxa" w:w="1080"/>
+            <w:tcW w:type="dxa" w:w="1128"/>
           </w:tcPr>
           <w:p>
             <w:pPr>
@@ -454,7 +454,7 @@
         </w:tc>
         <w:tc>
           <w:tcPr>
-            <w:tcW w:type="dxa" w:w="1080"/>
+            <w:tcW w:type="dxa" w:w="1128"/>
           </w:tcPr>
           <w:p>
             <w:pPr>
@@ -473,7 +473,7 @@
       <w:tr>
         <w:tc>
           <w:tcPr>
-            <w:tcW w:type="dxa" w:w="1080"/>
+            <w:tcW w:type="dxa" w:w="1128"/>
           </w:tcPr>
           <w:p>
             <w:pPr>
@@ -490,7 +490,7 @@
         </w:tc>
         <w:tc>
           <w:tcPr>
-            <w:tcW w:type="dxa" w:w="1080"/>
+            <w:tcW w:type="dxa" w:w="1128"/>
           </w:tcPr>
           <w:p>
             <w:pPr>
@@ -507,7 +507,7 @@
         </w:tc>
         <w:tc>
           <w:tcPr>
-            <w:tcW w:type="dxa" w:w="1080"/>
+            <w:tcW w:type="dxa" w:w="1128"/>
           </w:tcPr>
           <w:p>
             <w:pPr>
@@ -524,7 +524,7 @@
         </w:tc>
         <w:tc>
           <w:tcPr>
-            <w:tcW w:type="dxa" w:w="1080"/>
+            <w:tcW w:type="dxa" w:w="1128"/>
           </w:tcPr>
           <w:p>
             <w:pPr>
@@ -541,7 +541,7 @@
         </w:tc>
         <w:tc>
           <w:tcPr>
-            <w:tcW w:type="dxa" w:w="1080"/>
+            <w:tcW w:type="dxa" w:w="1128"/>
           </w:tcPr>
           <w:p>
             <w:pPr>
@@ -558,7 +558,7 @@
         </w:tc>
         <w:tc>
           <w:tcPr>
-            <w:tcW w:type="dxa" w:w="1080"/>
+            <w:tcW w:type="dxa" w:w="1128"/>
           </w:tcPr>
           <w:p>
             <w:pPr>
@@ -575,7 +575,7 @@
         </w:tc>
         <w:tc>
           <w:tcPr>
-            <w:tcW w:type="dxa" w:w="1080"/>
+            <w:tcW w:type="dxa" w:w="1128"/>
           </w:tcPr>
           <w:p>
             <w:pPr>
@@ -592,7 +592,7 @@
         </w:tc>
         <w:tc>
           <w:tcPr>
-            <w:tcW w:type="dxa" w:w="1080"/>
+            <w:tcW w:type="dxa" w:w="1128"/>
           </w:tcPr>
           <w:p>
             <w:pPr>
@@ -611,7 +611,7 @@
       <w:tr>
         <w:tc>
           <w:tcPr>
-            <w:tcW w:type="dxa" w:w="1080"/>
+            <w:tcW w:type="dxa" w:w="1128"/>
           </w:tcPr>
           <w:p>
             <w:pPr>
@@ -628,7 +628,7 @@
         </w:tc>
         <w:tc>
           <w:tcPr>
-            <w:tcW w:type="dxa" w:w="1080"/>
+            <w:tcW w:type="dxa" w:w="1128"/>
           </w:tcPr>
           <w:p>
             <w:pPr>
@@ -645,7 +645,7 @@
         </w:tc>
         <w:tc>
           <w:tcPr>
-            <w:tcW w:type="dxa" w:w="1080"/>
+            <w:tcW w:type="dxa" w:w="1128"/>
           </w:tcPr>
           <w:p>
             <w:pPr>
@@ -662,7 +662,7 @@
         </w:tc>
         <w:tc>
           <w:tcPr>
-            <w:tcW w:type="dxa" w:w="1080"/>
+            <w:tcW w:type="dxa" w:w="1128"/>
           </w:tcPr>
           <w:p>
             <w:pPr>
@@ -679,7 +679,7 @@
         </w:tc>
         <w:tc>
           <w:tcPr>
-            <w:tcW w:type="dxa" w:w="1080"/>
+            <w:tcW w:type="dxa" w:w="1128"/>
           </w:tcPr>
           <w:p>
             <w:pPr>
@@ -696,7 +696,7 @@
         </w:tc>
         <w:tc>
           <w:tcPr>
-            <w:tcW w:type="dxa" w:w="1080"/>
+            <w:tcW w:type="dxa" w:w="1128"/>
           </w:tcPr>
           <w:p>
             <w:pPr>
@@ -713,7 +713,7 @@
         </w:tc>
         <w:tc>
           <w:tcPr>
-            <w:tcW w:type="dxa" w:w="1080"/>
+            <w:tcW w:type="dxa" w:w="1128"/>
           </w:tcPr>
           <w:p>
             <w:pPr>
@@ -730,7 +730,7 @@
         </w:tc>
         <w:tc>
           <w:tcPr>
-            <w:tcW w:type="dxa" w:w="1080"/>
+            <w:tcW w:type="dxa" w:w="1128"/>
           </w:tcPr>
           <w:p>
             <w:pPr>
@@ -765,7 +765,7 @@
         <w:rPr>
           <w:i w:val="0"/>
         </w:rPr>
-        <w:t>The selected model is the lasso (glmnet) binary logistic regression at a referral threshold of 0.24. The threshold was fixed on cross-validation, never on the test set, using a policy rule agreed before evaluation: find at least 80% of at-risk households at the fewest referrals. On the test set it finds 80.7% of at-risk households and 85.7% of the severely food insecure, while referring 58.9% of households at 41.9% precision. The F2-optimal threshold of 0.14 was rejected because it refers 83.8% of all households — more outreach capacity than the institute has — and the default 0.5 was rejected because it misses 68.9% of at-risk households. The random forest scores marginally higher (AUC 0.745 against 0.736; bootstrap difference +0.009, 95% CI 0.002–0.016), but the logistic model was chosen for one interpretable odds ratio per factor, equally good calibration and a direct fit with the Shiny app. The gain is real but too small to pay for the loss of explanation in a tool that must justify every referral to an official.</w:t>
+        <w:t>The selected model is the lasso (glmnet) binary logistic regression at a referral threshold of 0.24. The threshold was fixed on cross-validation, never on the test set, using a policy rule agreed before evaluation: find at least 80% of at-risk households at the fewest referrals. On the test set it finds 80.7% of at-risk households and 85.7% of the severely food insecure, while referring 58.9% of households at 41.9% precision. The F2-optimal threshold of 0.14 was rejected because it refers 83.8% of all households, and the default 0.5 because it misses 68.9% of at-risk households. The random forest scores marginally higher (AUC 0.745 against 0.736; bootstrap difference +0.009, 95% CI 0.002–0.016), but the logistic model was chosen for one interpretable odds ratio per factor, equally good calibration and a direct fit with the Shiny app — a gain too small to pay for the loss of explanation in a tool that must justify every referral to an official.</w:t>
       </w:r>
     </w:p>
     <w:p>
@@ -773,7 +773,7 @@
         <w:rPr>
           <w:i w:val="0"/>
         </w:rPr>
-        <w:t>The model generalises: cross-validated AUC was 0.733 against 0.736 on test, a gap of 0.0024, so there is no meaningful overfitting. Its probabilities are usable as probabilities rather than just as a ranking (Brier 0.180, expected calibration error 0.012). Re-weighting the test set with the survey weights moves recall from 80.7% to 78.3%, so the result is not an artefact of the sample design.</w:t>
+        <w:t>It generalises and it is calibrated: cross-validated AUC 0.733 against 0.736 on test (gap 0.0024, so no meaningful overfitting), Brier 0.180 and expected calibration error 0.012, so the scores are usable as probabilities and not only as a ranking. Survey-weighting the test set moves recall only from 80.7% to 78.3%.</w:t>
       </w:r>
     </w:p>
     <w:p>
@@ -789,7 +789,7 @@
         <w:rPr>
           <w:i w:val="0"/>
         </w:rPr>
-        <w:t>Permutation importance on the test set ranks the drivers consistently across all three models: income change vs a year ago (0.082), income per person (0.033), number of grant recipients (0.029), household income (log) (0.021). Everything else — electricity, settlement type, toilet type and household size — adds little once income is known. The odds ratios below come from an unpenalised logistic fit on the training data; Person A's tuned penalty was effectively zero, so they describe the deployed model while adding confidence intervals. All of these are associations, not causes.</w:t>
+        <w:t>Permutation importance ranks the drivers consistently across all three models: income change vs a year ago (0.082), income per person (0.033), number of grant recipients (0.029), household income (log) (0.021). Electricity, settlement type, toilet type and household size add little once income is known. The odds ratios below come from an unpenalised logistic fit on the training data (Person A's tuned penalty was effectively zero), so they describe the deployed model while adding confidence intervals — as associations, not causes.</w:t>
       </w:r>
     </w:p>
     <w:p>
@@ -812,14 +812,14 @@
         <w:tblLook w:firstColumn="1" w:firstRow="1" w:lastColumn="0" w:lastRow="0" w:noHBand="0" w:noVBand="1" w:val="04A0"/>
       </w:tblPr>
       <w:tblGrid>
-        <w:gridCol w:w="2880"/>
-        <w:gridCol w:w="2880"/>
-        <w:gridCol w:w="2880"/>
+        <w:gridCol w:w="3009"/>
+        <w:gridCol w:w="3009"/>
+        <w:gridCol w:w="3009"/>
       </w:tblGrid>
       <w:tr>
         <w:tc>
           <w:tcPr>
-            <w:tcW w:type="dxa" w:w="2880"/>
+            <w:tcW w:type="dxa" w:w="3009"/>
           </w:tcPr>
           <w:p>
             <w:pPr>
@@ -836,7 +836,7 @@
         </w:tc>
         <w:tc>
           <w:tcPr>
-            <w:tcW w:type="dxa" w:w="2880"/>
+            <w:tcW w:type="dxa" w:w="3009"/>
           </w:tcPr>
           <w:p>
             <w:pPr>
@@ -853,7 +853,7 @@
         </w:tc>
         <w:tc>
           <w:tcPr>
-            <w:tcW w:type="dxa" w:w="2880"/>
+            <w:tcW w:type="dxa" w:w="3009"/>
           </w:tcPr>
           <w:p>
             <w:pPr>
@@ -872,7 +872,7 @@
       <w:tr>
         <w:tc>
           <w:tcPr>
-            <w:tcW w:type="dxa" w:w="2880"/>
+            <w:tcW w:type="dxa" w:w="3009"/>
           </w:tcPr>
           <w:p>
             <w:pPr>
@@ -889,7 +889,7 @@
         </w:tc>
         <w:tc>
           <w:tcPr>
-            <w:tcW w:type="dxa" w:w="2880"/>
+            <w:tcW w:type="dxa" w:w="3009"/>
           </w:tcPr>
           <w:p>
             <w:pPr>
@@ -900,13 +900,13 @@
                 <w:b w:val="0"/>
                 <w:sz w:val="18"/>
               </w:rPr>
-              <w:t>58.3% food insecure where income is much lower, against 18.4–21.2% mid-scale; OR 2.05 (1.62–2.59). Strongest predictor in every model. But code 1 (much higher) is also 34.8%.</w:t>
+              <w:t>58.3% vs 18.4–21.2% mid-scale; OR 2.05 (1.62–2.59). But code 1 (much higher) is also 34.8%.</w:t>
             </w:r>
           </w:p>
         </w:tc>
         <w:tc>
           <w:tcPr>
-            <w:tcW w:type="dxa" w:w="2880"/>
+            <w:tcW w:type="dxa" w:w="3009"/>
           </w:tcPr>
           <w:p>
             <w:pPr>
@@ -917,7 +917,7 @@
                 <w:b w:val="0"/>
                 <w:sz w:val="18"/>
               </w:rPr>
-              <w:t>Supported; U-shaped, not linear</w:t>
+              <w:t>Supported; U-shaped</w:t>
             </w:r>
           </w:p>
         </w:tc>
@@ -925,7 +925,7 @@
       <w:tr>
         <w:tc>
           <w:tcPr>
-            <w:tcW w:type="dxa" w:w="2880"/>
+            <w:tcW w:type="dxa" w:w="3009"/>
           </w:tcPr>
           <w:p>
             <w:pPr>
@@ -942,7 +942,7 @@
         </w:tc>
         <w:tc>
           <w:tcPr>
-            <w:tcW w:type="dxa" w:w="2880"/>
+            <w:tcW w:type="dxa" w:w="3009"/>
           </w:tcPr>
           <w:p>
             <w:pPr>
@@ -953,13 +953,13 @@
                 <w:b w:val="0"/>
                 <w:sz w:val="18"/>
               </w:rPr>
-              <w:t>Raw 34.8% rural against 28.5% urban, but adjusted OR 0.76 (0.66–0.87).</w:t>
+              <w:t>34.8% vs 28.5% urban raw; adjusted OR 0.76 (0.66–0.87).</w:t>
             </w:r>
           </w:p>
         </w:tc>
         <w:tc>
           <w:tcPr>
-            <w:tcW w:type="dxa" w:w="2880"/>
+            <w:tcW w:type="dxa" w:w="3009"/>
           </w:tcPr>
           <w:p>
             <w:pPr>
@@ -978,7 +978,7 @@
       <w:tr>
         <w:tc>
           <w:tcPr>
-            <w:tcW w:type="dxa" w:w="2880"/>
+            <w:tcW w:type="dxa" w:w="3009"/>
           </w:tcPr>
           <w:p>
             <w:pPr>
@@ -995,7 +995,7 @@
         </w:tc>
         <w:tc>
           <w:tcPr>
-            <w:tcW w:type="dxa" w:w="2880"/>
+            <w:tcW w:type="dxa" w:w="3009"/>
           </w:tcPr>
           <w:p>
             <w:pPr>
@@ -1006,13 +1006,13 @@
                 <w:b w:val="0"/>
                 <w:sz w:val="18"/>
               </w:rPr>
-              <w:t>OR 1.04 (1.01–1.07) per member. Raw rates rise 26.8% → 42.6%, but mostly through income per person (importance rank 2).</w:t>
+              <w:t>OR 1.04 (1.01–1.07) per member; raw 26.8% → 42.6%, mostly via income per person.</w:t>
             </w:r>
           </w:p>
         </w:tc>
         <w:tc>
           <w:tcPr>
-            <w:tcW w:type="dxa" w:w="2880"/>
+            <w:tcW w:type="dxa" w:w="3009"/>
           </w:tcPr>
           <w:p>
             <w:pPr>
@@ -1023,7 +1023,7 @@
                 <w:b w:val="0"/>
                 <w:sz w:val="18"/>
               </w:rPr>
-              <w:t>Supported, weak direct effect</w:t>
+              <w:t>Supported; weak direct effect</w:t>
             </w:r>
           </w:p>
         </w:tc>
@@ -1031,7 +1031,7 @@
       <w:tr>
         <w:tc>
           <w:tcPr>
-            <w:tcW w:type="dxa" w:w="2880"/>
+            <w:tcW w:type="dxa" w:w="3009"/>
           </w:tcPr>
           <w:p>
             <w:pPr>
@@ -1048,7 +1048,7 @@
         </w:tc>
         <w:tc>
           <w:tcPr>
-            <w:tcW w:type="dxa" w:w="2880"/>
+            <w:tcW w:type="dxa" w:w="3009"/>
           </w:tcPr>
           <w:p>
             <w:pPr>
@@ -1059,13 +1059,13 @@
                 <w:b w:val="0"/>
                 <w:sz w:val="18"/>
               </w:rPr>
-              <w:t>47.0% against 29.7%; OR 2.07 (1.73–2.48). Only ~5% of households lack electricity, so it carries little predictive weight.</w:t>
+              <w:t>47.0% vs 29.7%; OR 2.07 (1.73–2.48). Only ~5% of households affected.</w:t>
             </w:r>
           </w:p>
         </w:tc>
         <w:tc>
           <w:tcPr>
-            <w:tcW w:type="dxa" w:w="2880"/>
+            <w:tcW w:type="dxa" w:w="3009"/>
           </w:tcPr>
           <w:p>
             <w:pPr>
@@ -1084,7 +1084,7 @@
       <w:tr>
         <w:tc>
           <w:tcPr>
-            <w:tcW w:type="dxa" w:w="2880"/>
+            <w:tcW w:type="dxa" w:w="3009"/>
           </w:tcPr>
           <w:p>
             <w:pPr>
@@ -1101,7 +1101,7 @@
         </w:tc>
         <w:tc>
           <w:tcPr>
-            <w:tcW w:type="dxa" w:w="2880"/>
+            <w:tcW w:type="dxa" w:w="3009"/>
           </w:tcPr>
           <w:p>
             <w:pPr>
@@ -1112,13 +1112,13 @@
                 <w:b w:val="0"/>
                 <w:sz w:val="18"/>
               </w:rPr>
-              <w:t>The reverse: 37.6% against 20.6%; OR 1.20 (1.16–1.24) per recipient. Grants are means-tested, so they mark poorer households.</w:t>
+              <w:t>Reversed: 37.6% vs 20.6%; OR 1.20 (1.16–1.24) per recipient. Grants are means-tested.</w:t>
             </w:r>
           </w:p>
         </w:tc>
         <w:tc>
           <w:tcPr>
-            <w:tcW w:type="dxa" w:w="2880"/>
+            <w:tcW w:type="dxa" w:w="3009"/>
           </w:tcPr>
           <w:p>
             <w:pPr>
@@ -1129,7 +1129,7 @@
                 <w:b w:val="0"/>
                 <w:sz w:val="18"/>
               </w:rPr>
-              <w:t>Not supported (reversed); targeting, not causation</w:t>
+              <w:t>Not supported; targeting, not cause</w:t>
             </w:r>
           </w:p>
         </w:tc>
@@ -1137,7 +1137,7 @@
       <w:tr>
         <w:tc>
           <w:tcPr>
-            <w:tcW w:type="dxa" w:w="2880"/>
+            <w:tcW w:type="dxa" w:w="3009"/>
           </w:tcPr>
           <w:p>
             <w:pPr>
@@ -1154,7 +1154,7 @@
         </w:tc>
         <w:tc>
           <w:tcPr>
-            <w:tcW w:type="dxa" w:w="2880"/>
+            <w:tcW w:type="dxa" w:w="3009"/>
           </w:tcPr>
           <w:p>
             <w:pPr>
@@ -1165,13 +1165,13 @@
                 <w:b w:val="0"/>
                 <w:sz w:val="18"/>
               </w:rPr>
-              <w:t>Code 5 (VIP pit latrine, 4,191 households) 40.9% against 27.2% for flush toilets; OR 1.31 (1.13–1.52). Permutation importance near zero.</w:t>
+              <w:t>Code 5 (4,191 households) 40.9% vs 27.2%; OR 1.31 (1.13–1.52). Importance near zero.</w:t>
             </w:r>
           </w:p>
         </w:tc>
         <w:tc>
           <w:tcPr>
-            <w:tcW w:type="dxa" w:w="2880"/>
+            <w:tcW w:type="dxa" w:w="3009"/>
           </w:tcPr>
           <w:p>
             <w:pPr>
@@ -1182,7 +1182,7 @@
                 <w:b w:val="0"/>
                 <w:sz w:val="18"/>
               </w:rPr>
-              <w:t>Partly: significant, but little predictive value</w:t>
+              <w:t>Partly; little predictive value</w:t>
             </w:r>
           </w:p>
         </w:tc>
@@ -1198,12 +1198,7 @@
         <w:rPr>
           <w:i w:val="0"/>
         </w:rPr>
-        <w:t>Performance is uneven, and the gaps matter more than the averages. The screen finds 94.0% of at-risk households earning under R2,500 a month but only 39.2% of those earning over R11,500, and 61.7% of households with no grant recipients against 88.0% of those with them. By province, recall runs from 70.8% in Gauteng and 70.9% in the Western Cape to 89.3% in the Eastern Cape. The model is weakest exactly where food insecurity is least expected, which is a reason to keep self-referral channels open rather than to trust a ‘lower risk’ result.</w:t>
-      </w:r>
-    </w:p>
-    <w:p>
-      <w:r>
-        <w:br w:type="page"/>
+        <w:t>The gaps matter more than the averages. The screen finds 94.0% of at-risk households earning under R2,500 a month but only 39.2% of those over R11,500, and 61.7% of households with no grant recipients against 88.0% of those with them. By province recall runs from 70.8% (Gauteng) to 89.3% (Eastern Cape). It is weakest exactly where food insecurity is least expected — a reason to keep self-referral open rather than trust a ‘lower risk’ result.</w:t>
       </w:r>
     </w:p>
     <w:p>
@@ -1243,7 +1238,7 @@
         <w:t>1. Deploy the screen for outreach triage only, and resource it for the referral rate it actually produces.</w:t>
       </w:r>
       <w:r>
-        <w:t xml:space="preserve"> At threshold 0.24 the tool refers 58.9% of households and 58.1% of those referrals turn out to be food secure. Programme managers should size follow-up capacity against that rate before go-live, or raise the threshold knowingly and accept lower recall. The institute's analytics team owns the threshold decision jointly with programme managers; it is a policy choice, not a technical one.</w:t>
+        <w:t xml:space="preserve"> At threshold 0.24 the tool refers 58.9% of households and 58.1% of those referrals turn out to be food secure. Programme managers should size follow-up capacity against that rate before go-live, or raise the threshold knowingly and accept lower recall; it is a policy choice, not a technical one. Monitoring should raise an alert if recall on followed-up households falls below 70.7%.</w:t>
       </w:r>
     </w:p>
     <w:p>
@@ -1308,21 +1303,6 @@
     </w:p>
     <w:p>
       <w:pPr>
-        <w:pStyle w:val="ListBullet"/>
-        <w:spacing w:after="80"/>
-      </w:pPr>
-      <w:r>
-        <w:rPr>
-          <w:b/>
-        </w:rPr>
-        <w:t>6. Re-evaluate at every new GHS release, and improve the inputs before the next model.</w:t>
-      </w:r>
-      <w:r>
-        <w:t xml:space="preserve"> Monitoring should raise an alert if recall on followed-up households drops below 70.7% or the referral rate drifts far from 58.9%. The analytics team should add per-person income and employment detail (D01–D03), debt and local food prices, and — most valuable of all — recorded follow-up outcomes, which would let the next model be validated against what officials actually found.</w:t>
-      </w:r>
-    </w:p>
-    <w:p>
-      <w:pPr>
         <w:pStyle w:val="Heading1"/>
       </w:pPr>
       <w:r>
@@ -1351,7 +1331,7 @@
         <w:rPr>
           <w:i w:val="0"/>
         </w:rPr>
-        <w:t>The evidence is one cross-sectional wave of the General Household Survey 2024, so every result is an association rather than a cause; the reversed grant finding (H5) is the clearest case where targeting and effect cannot be separated. The target itself is a proxy built from self-reported food-insecurity items, which carry recall and social-desirability bias. The three-tier version of the target was abandoned because the middle tier is not separable with these predictors, so the tool cannot grade severity, only flag risk. Training used the unweighted sample; the survey-weighted check moves recall by about 2.4 points. Person-level files (D01–D03) and the separate D11 labour survey were excluded in Milestone 2, and 15 households with no valid food-insecurity answers are unscorable. Small subgroups — farms (197 test households) and the smaller provinces — have wide confidence intervals, so their apparent gaps cannot be judged precisely. Most importantly, the model has never been validated outside this survey: there is no external cohort and no record of what officials found when they followed up.</w:t>
+        <w:t>The evidence is one cross-sectional wave of the General Household Survey 2024, so every result is an association rather than a cause; the reversed grant finding (H5) is the clearest case where targeting and effect cannot be separated. The target is itself a proxy built from self-reported items, which carry recall and social-desirability bias, and its three-tier version was abandoned because the middle tier is not separable with these predictors, so the tool cannot grade severity. Training used the unweighted sample (survey-weighting moves recall by 2.4 points); the person-level files D01–D03 and the D11 labour survey were excluded in Milestone 2; and small subgroups such as farms (197 test households) have intervals too wide to judge. Most importantly, the model has never been validated outside this survey: there is no external cohort and no record of what officials found when they followed up.</w:t>
       </w:r>
     </w:p>
     <w:p>
@@ -1363,8 +1343,8 @@
       </w:r>
     </w:p>
     <w:sectPr>
-      <w:pgSz w:w="12240" w:h="15840"/>
-      <w:pgMar w:top="1440" w:right="1800" w:bottom="1440" w:left="1800" w:header="720" w:footer="720" w:gutter="0"/>
+      <w:pgSz w:w="11906" w:h="16838"/>
+      <w:pgMar w:top="1440" w:right="1440" w:bottom="1440" w:left="1440" w:header="720" w:footer="720" w:gutter="0"/>
       <w:cols w:space="720"/>
       <w:docGrid w:linePitch="360"/>
     </w:sectPr>

</xml_diff>